<commit_message>
docs: add light theme screenshots to report and README
</commit_message>
<xml_diff>
--- a/docs/Personal_Finance_Tracker_Project_Report.docx
+++ b/docs/Personal_Finance_Tracker_Project_Report.docx
@@ -2188,12 +2188,7 @@
         </w:rPr>
       </w:pPr>
       <w:r>
-        <w:rPr>
-          <w:rFonts w:cs="Times New Roman"/>
-          <w:sz w:val="24"/>
-          <w:szCs w:val="24"/>
-        </w:rPr>
-        <w:t>The dashboard presents calculated net balance, income, expenses, recent activity, and a seven-day spending chart. Transactions can be added, edited, or deleted using a validated form. Named routes connect Dashboard, Transactions, Analytics, and the form; Provider refreshes the screens when ledger state changes. LayoutBuilder switches summary cards between one, two, and three columns, while app navigation changes from bottom bar to sidebar on wider screens. Light and dark themes share reusable widgets. AnimatedSwitcher transitions balance updates and honors the platform reduced-motion setting. Analytics groups expense totals and fetches a dated Frankfurter USD/INR reference rate. The API service validates the response and has loading, failure, timeout, and retry behavior. Sample transactions are clearly identified as demo data and are not persistent.</w:t>
+        <w:t>The dashboard presents calculated net balance, income, expenses, recent activity, and a seven-day spending chart. Transactions can be added, edited, or deleted using a validated form. Named routes connect Dashboard, Transactions, Analytics, and the form; Provider refreshes the screens when ledger state changes. LayoutBuilder switches summary cards between one, two, and three columns, while app navigation changes from bottom bar to sidebar on wider screens. Light and dark themes share reusable widgets. AnimatedSwitcher transitions balance updates and honors the platform reduced-motion setting. Analytics groups expense totals and fetches a dated Frankfurter USD/INR reference rate. The API service validates the response and has loading, failure, timeout, and retry behavior. Sample transactions are clearly identified as demo data and are not persistent. Appendices A and C show the running application in its light theme.</w:t>
       </w:r>
     </w:p>
     <w:p>
@@ -2723,11 +2718,7 @@
         <w:jc w:val="center"/>
       </w:pPr>
       <w:r>
-        <w:rPr>
-          <w:i/>
-          <w:sz w:val="20"/>
-        </w:rPr>
-        <w:t>Appendix A — Dashboard, desktop viewport (1242 × 761).</w:t>
+        <w:t>Appendix A — Dashboard, desktop viewport, light theme (1242 × 763).</w:t>
       </w:r>
     </w:p>
     <w:p>
@@ -2737,8 +2728,8 @@
       <w:r>
         <w:drawing>
           <wp:inline xmlns:a="http://schemas.openxmlformats.org/drawingml/2006/main" xmlns:pic="http://schemas.openxmlformats.org/drawingml/2006/picture">
-            <wp:extent cx="5897880" cy="3613757"/>
-            <wp:docPr id="2" name="Picture 2" descr="Genuine desktop capture of the running Flutter dashboard, showing the demo balance and spending summary."/>
+            <wp:extent cx="5897880" cy="3623255"/>
+            <wp:docPr id="5" name="Picture 5" descr="Dashboard, desktop viewport, light theme"/>
             <wp:cNvGraphicFramePr>
               <a:graphicFrameLocks noChangeAspect="1"/>
             </wp:cNvGraphicFramePr>
@@ -2746,11 +2737,11 @@
               <a:graphicData uri="http://schemas.openxmlformats.org/drawingml/2006/picture">
                 <pic:pic>
                   <pic:nvPicPr>
-                    <pic:cNvPr id="0" name="dashboard-desktop.png"/>
+                    <pic:cNvPr id="0" name="dashboard-light-desktop.png"/>
                     <pic:cNvPicPr/>
                   </pic:nvPicPr>
                   <pic:blipFill>
-                    <a:blip r:embed="rId12"/>
+                    <a:blip r:embed="rId15"/>
                     <a:stretch>
                       <a:fillRect/>
                     </a:stretch>
@@ -2758,7 +2749,7 @@
                   <pic:spPr>
                     <a:xfrm>
                       <a:off x="0" y="0"/>
-                      <a:ext cx="5897880" cy="3613757"/>
+                      <a:ext cx="5897880" cy="3623255"/>
                     </a:xfrm>
                     <a:prstGeom prst="rect"/>
                   </pic:spPr>
@@ -2827,11 +2818,7 @@
         <w:jc w:val="center"/>
       </w:pPr>
       <w:r>
-        <w:rPr>
-          <w:i/>
-          <w:sz w:val="20"/>
-        </w:rPr>
-        <w:t>Appendix C — Analytics and dated USD/INR reference rate (1240 × 765).</w:t>
+        <w:t>Appendix C — Analytics and dated USD/INR reference rate, light theme (1238 × 751).</w:t>
       </w:r>
     </w:p>
     <w:p>
@@ -2841,8 +2828,8 @@
       <w:r>
         <w:drawing>
           <wp:inline xmlns:a="http://schemas.openxmlformats.org/drawingml/2006/main" xmlns:pic="http://schemas.openxmlformats.org/drawingml/2006/picture">
-            <wp:extent cx="4754880" cy="2933454"/>
-            <wp:docPr id="4" name="Picture 4" descr="Genuine desktop capture of the running Analytics screen showing the Frankfurter reference rate and expense categories."/>
+            <wp:extent cx="4754880" cy="2884422"/>
+            <wp:docPr id="6" name="Picture 6" descr="Analytics with USD/INR reference rate, light theme"/>
             <wp:cNvGraphicFramePr>
               <a:graphicFrameLocks noChangeAspect="1"/>
             </wp:cNvGraphicFramePr>
@@ -2850,11 +2837,11 @@
               <a:graphicData uri="http://schemas.openxmlformats.org/drawingml/2006/picture">
                 <pic:pic>
                   <pic:nvPicPr>
-                    <pic:cNvPr id="0" name="analytics-exchange-rate-desktop.png"/>
+                    <pic:cNvPr id="0" name="analytics-exchange-rate-light-desktop.png"/>
                     <pic:cNvPicPr/>
                   </pic:nvPicPr>
                   <pic:blipFill>
-                    <a:blip r:embed="rId14"/>
+                    <a:blip r:embed="rId16"/>
                     <a:stretch>
                       <a:fillRect/>
                     </a:stretch>
@@ -2862,7 +2849,7 @@
                   <pic:spPr>
                     <a:xfrm>
                       <a:off x="0" y="0"/>
-                      <a:ext cx="4754880" cy="2933454"/>
+                      <a:ext cx="4754880" cy="2884422"/>
                     </a:xfrm>
                     <a:prstGeom prst="rect"/>
                   </pic:spPr>

</xml_diff>